<commit_message>
docs: ajout README et finalisation de la stack multi-services
</commit_message>
<xml_diff>
--- a/TP-docker-compose-multi-services.docx
+++ b/TP-docker-compose-multi-services.docx
@@ -50,18 +50,7 @@
     </w:p>
     <w:p>
       <w:pPr>
-        <w:rPr/>
-      </w:pPr>
-      <w:r>
-        <w:rPr>
-          <w:rtl w:val="0"/>
-        </w:rPr>
-      </w:r>
-    </w:p>
-    <w:p>
-      <w:pPr>
         <w:widowControl w:val="1"/>
-        <w:spacing w:before="0" w:line="276" w:lineRule="auto"/>
         <w:jc w:val="center"/>
         <w:rPr/>
       </w:pPr>
@@ -74,12 +63,12 @@
           <wp:inline distB="114300" distT="114300" distL="114300" distR="114300">
             <wp:extent cx="3357563" cy="3351985"/>
             <wp:effectExtent b="0" l="0" r="0" t="0"/>
-            <wp:docPr id="18" name="image1.png"/>
+            <wp:docPr id="53" name="image57.png"/>
             <a:graphic>
               <a:graphicData uri="http://schemas.openxmlformats.org/drawingml/2006/picture">
                 <pic:pic>
                   <pic:nvPicPr>
-                    <pic:cNvPr id="0" name="image1.png"/>
+                    <pic:cNvPr id="0" name="image57.png"/>
                     <pic:cNvPicPr preferRelativeResize="0"/>
                   </pic:nvPicPr>
                   <pic:blipFill>
@@ -111,6 +100,19 @@
     </w:p>
     <w:p>
       <w:pPr>
+        <w:widowControl w:val="1"/>
+        <w:spacing w:before="0" w:line="276" w:lineRule="auto"/>
+        <w:jc w:val="center"/>
+        <w:rPr/>
+      </w:pPr>
+      <w:r>
+        <w:rPr>
+          <w:rtl w:val="0"/>
+        </w:rPr>
+      </w:r>
+    </w:p>
+    <w:p>
+      <w:pPr>
         <w:pageBreakBefore w:val="0"/>
         <w:pBdr>
           <w:top w:space="0" w:sz="0" w:val="nil"/>
@@ -341,7 +343,7 @@
     </w:p>
     <w:sdt>
       <w:sdtPr>
-        <w:id w:val="1577893422"/>
+        <w:id w:val="208659621"/>
         <w:docPartObj>
           <w:docPartGallery w:val="Table of Contents"/>
           <w:docPartUnique w:val="1"/>
@@ -372,7 +374,7 @@
           </w:pPr>
           <w:r>
             <w:fldChar w:fldCharType="begin"/>
-            <w:instrText xml:space="preserve"> TOC \h \u \z \t "Heading 1,1,Heading 2,2,Heading 3,3,Heading 4,4,Heading 5,5,Heading 6,6,"</w:instrText>
+            <w:instrText xml:space="preserve"> TOC \h \u \z \t "Heading 1,1,Heading 3,3,Heading 4,4,Heading 5,5,Heading 6,6,"</w:instrText>
             <w:fldChar w:fldCharType="separate"/>
           </w:r>
           <w:hyperlink w:anchor="_yspy8tt3f0xe">
@@ -446,7 +448,7 @@
               </w:rPr>
               <w:t xml:space="preserve">Contexte</w:t>
               <w:tab/>
-              <w:t xml:space="preserve">2</w:t>
+              <w:t xml:space="preserve">3</w:t>
             </w:r>
           </w:hyperlink>
           <w:r>
@@ -497,7 +499,7 @@
               </w:rPr>
               <w:t xml:space="preserve">1. Objectifs pédagogiques</w:t>
               <w:tab/>
-              <w:t xml:space="preserve">3</w:t>
+              <w:t xml:space="preserve">4</w:t>
             </w:r>
           </w:hyperlink>
           <w:r>
@@ -548,7 +550,7 @@
               </w:rPr>
               <w:t xml:space="preserve">2. Architecture cible</w:t>
               <w:tab/>
-              <w:t xml:space="preserve">4</w:t>
+              <w:t xml:space="preserve">5</w:t>
             </w:r>
           </w:hyperlink>
           <w:r>
@@ -599,7 +601,7 @@
               </w:rPr>
               <w:t xml:space="preserve">3. URLs attendues</w:t>
               <w:tab/>
-              <w:t xml:space="preserve">4</w:t>
+              <w:t xml:space="preserve">5</w:t>
             </w:r>
           </w:hyperlink>
           <w:r>
@@ -650,7 +652,7 @@
               </w:rPr>
               <w:t xml:space="preserve">4. Arborescence attendue</w:t>
               <w:tab/>
-              <w:t xml:space="preserve">5</w:t>
+              <w:t xml:space="preserve">6</w:t>
             </w:r>
           </w:hyperlink>
           <w:r>
@@ -701,59 +703,7 @@
               </w:rPr>
               <w:t xml:space="preserve">5. Étape 1 — Préparer les images des applications</w:t>
               <w:tab/>
-              <w:t xml:space="preserve">5</w:t>
-            </w:r>
-          </w:hyperlink>
-          <w:r>
-            <w:rPr>
-              <w:rtl w:val="0"/>
-            </w:rPr>
-          </w:r>
-        </w:p>
-        <w:p>
-          <w:pPr>
-            <w:tabs>
-              <w:tab w:val="right" w:leader="none" w:pos="12000"/>
-            </w:tabs>
-            <w:spacing w:before="60" w:line="240" w:lineRule="auto"/>
-            <w:ind w:left="360" w:firstLine="0"/>
-            <w:rPr>
-              <w:rFonts w:ascii="Arial" w:cs="Arial" w:eastAsia="Arial" w:hAnsi="Arial"/>
-              <w:b w:val="0"/>
-              <w:bCs w:val="0"/>
-              <w:i w:val="0"/>
-              <w:iCs w:val="0"/>
-              <w:smallCaps w:val="0"/>
-              <w:strike w:val="0"/>
-              <w:color w:val="000000"/>
-              <w:sz w:val="22"/>
-              <w:szCs w:val="22"/>
-              <w:u w:val="none"/>
-              <w:shd w:fill="auto" w:val="clear"/>
-              <w:vertAlign w:val="baseline"/>
-            </w:rPr>
-          </w:pPr>
-          <w:hyperlink w:anchor="_45atz0514lv3">
-            <w:r>
-              <w:rPr>
-                <w:rFonts w:ascii="Droid Serif" w:cs="Droid Serif" w:eastAsia="Droid Serif" w:hAnsi="Droid Serif"/>
-                <w:b w:val="0"/>
-                <w:bCs w:val="0"/>
-                <w:i w:val="0"/>
-                <w:iCs w:val="0"/>
-                <w:smallCaps w:val="0"/>
-                <w:strike w:val="0"/>
-                <w:color w:val="000000"/>
-                <w:sz w:val="22"/>
-                <w:szCs w:val="22"/>
-                <w:u w:val="none"/>
-                <w:shd w:fill="auto" w:val="clear"/>
-                <w:vertAlign w:val="baseline"/>
-                <w:rtl w:val="0"/>
-              </w:rPr>
-              <w:t xml:space="preserve">Questions</w:t>
-              <w:tab/>
-              <w:t xml:space="preserve">9</w:t>
+              <w:t xml:space="preserve">6</w:t>
             </w:r>
           </w:hyperlink>
           <w:r>
@@ -804,59 +754,7 @@
               </w:rPr>
               <w:t xml:space="preserve">5.2 Backend Node.js / Express</w:t>
               <w:tab/>
-              <w:t xml:space="preserve">10</w:t>
-            </w:r>
-          </w:hyperlink>
-          <w:r>
-            <w:rPr>
-              <w:rtl w:val="0"/>
-            </w:rPr>
-          </w:r>
-        </w:p>
-        <w:p>
-          <w:pPr>
-            <w:tabs>
-              <w:tab w:val="right" w:leader="none" w:pos="12000"/>
-            </w:tabs>
-            <w:spacing w:before="60" w:line="240" w:lineRule="auto"/>
-            <w:ind w:left="360" w:firstLine="0"/>
-            <w:rPr>
-              <w:rFonts w:ascii="Arial" w:cs="Arial" w:eastAsia="Arial" w:hAnsi="Arial"/>
-              <w:b w:val="0"/>
-              <w:bCs w:val="0"/>
-              <w:i w:val="0"/>
-              <w:iCs w:val="0"/>
-              <w:smallCaps w:val="0"/>
-              <w:strike w:val="0"/>
-              <w:color w:val="000000"/>
-              <w:sz w:val="22"/>
-              <w:szCs w:val="22"/>
-              <w:u w:val="none"/>
-              <w:shd w:fill="auto" w:val="clear"/>
-              <w:vertAlign w:val="baseline"/>
-            </w:rPr>
-          </w:pPr>
-          <w:hyperlink w:anchor="_uig8h752yo6l">
-            <w:r>
-              <w:rPr>
-                <w:rFonts w:ascii="Droid Serif" w:cs="Droid Serif" w:eastAsia="Droid Serif" w:hAnsi="Droid Serif"/>
-                <w:b w:val="0"/>
-                <w:bCs w:val="0"/>
-                <w:i w:val="0"/>
-                <w:iCs w:val="0"/>
-                <w:smallCaps w:val="0"/>
-                <w:strike w:val="0"/>
-                <w:color w:val="000000"/>
-                <w:sz w:val="22"/>
-                <w:szCs w:val="22"/>
-                <w:u w:val="none"/>
-                <w:shd w:fill="auto" w:val="clear"/>
-                <w:vertAlign w:val="baseline"/>
-                <w:rtl w:val="0"/>
-              </w:rPr>
-              <w:t xml:space="preserve">Questions</w:t>
-              <w:tab/>
-              <w:t xml:space="preserve">12</w:t>
+              <w:t xml:space="preserve">11</w:t>
             </w:r>
           </w:hyperlink>
           <w:r>
@@ -907,59 +805,7 @@
               </w:rPr>
               <w:t xml:space="preserve">6. Étape 2 — Préparer l'image du reverse proxy Nginx</w:t>
               <w:tab/>
-              <w:t xml:space="preserve">13</w:t>
-            </w:r>
-          </w:hyperlink>
-          <w:r>
-            <w:rPr>
-              <w:rtl w:val="0"/>
-            </w:rPr>
-          </w:r>
-        </w:p>
-        <w:p>
-          <w:pPr>
-            <w:tabs>
-              <w:tab w:val="right" w:leader="none" w:pos="12000"/>
-            </w:tabs>
-            <w:spacing w:before="60" w:line="240" w:lineRule="auto"/>
-            <w:ind w:left="360" w:firstLine="0"/>
-            <w:rPr>
-              <w:rFonts w:ascii="Arial" w:cs="Arial" w:eastAsia="Arial" w:hAnsi="Arial"/>
-              <w:b w:val="0"/>
-              <w:bCs w:val="0"/>
-              <w:i w:val="0"/>
-              <w:iCs w:val="0"/>
-              <w:smallCaps w:val="0"/>
-              <w:strike w:val="0"/>
-              <w:color w:val="000000"/>
-              <w:sz w:val="22"/>
-              <w:szCs w:val="22"/>
-              <w:u w:val="none"/>
-              <w:shd w:fill="auto" w:val="clear"/>
-              <w:vertAlign w:val="baseline"/>
-            </w:rPr>
-          </w:pPr>
-          <w:hyperlink w:anchor="_gg454o7m2gwn">
-            <w:r>
-              <w:rPr>
-                <w:rFonts w:ascii="Droid Serif" w:cs="Droid Serif" w:eastAsia="Droid Serif" w:hAnsi="Droid Serif"/>
-                <w:b w:val="0"/>
-                <w:bCs w:val="0"/>
-                <w:i w:val="0"/>
-                <w:iCs w:val="0"/>
-                <w:smallCaps w:val="0"/>
-                <w:strike w:val="0"/>
-                <w:color w:val="000000"/>
-                <w:sz w:val="22"/>
-                <w:szCs w:val="22"/>
-                <w:u w:val="none"/>
-                <w:shd w:fill="auto" w:val="clear"/>
-                <w:vertAlign w:val="baseline"/>
-                <w:rtl w:val="0"/>
-              </w:rPr>
-              <w:t xml:space="preserve">6.1 Configuration du reverse proxy</w:t>
-              <w:tab/>
-              <w:t xml:space="preserve">13</w:t>
+              <w:t xml:space="preserve">14</w:t>
             </w:r>
           </w:hyperlink>
           <w:r>
@@ -1009,58 +855,6 @@
                 <w:rtl w:val="0"/>
               </w:rPr>
               <w:t xml:space="preserve">6.2 Dockerfile Nginx</w:t>
-              <w:tab/>
-              <w:t xml:space="preserve">14</w:t>
-            </w:r>
-          </w:hyperlink>
-          <w:r>
-            <w:rPr>
-              <w:rtl w:val="0"/>
-            </w:rPr>
-          </w:r>
-        </w:p>
-        <w:p>
-          <w:pPr>
-            <w:tabs>
-              <w:tab w:val="right" w:leader="none" w:pos="12000"/>
-            </w:tabs>
-            <w:spacing w:before="60" w:line="240" w:lineRule="auto"/>
-            <w:ind w:left="360" w:firstLine="0"/>
-            <w:rPr>
-              <w:rFonts w:ascii="Arial" w:cs="Arial" w:eastAsia="Arial" w:hAnsi="Arial"/>
-              <w:b w:val="0"/>
-              <w:bCs w:val="0"/>
-              <w:i w:val="0"/>
-              <w:iCs w:val="0"/>
-              <w:smallCaps w:val="0"/>
-              <w:strike w:val="0"/>
-              <w:color w:val="000000"/>
-              <w:sz w:val="22"/>
-              <w:szCs w:val="22"/>
-              <w:u w:val="none"/>
-              <w:shd w:fill="auto" w:val="clear"/>
-              <w:vertAlign w:val="baseline"/>
-            </w:rPr>
-          </w:pPr>
-          <w:hyperlink w:anchor="_gj0fnsw49pfd">
-            <w:r>
-              <w:rPr>
-                <w:rFonts w:ascii="Droid Serif" w:cs="Droid Serif" w:eastAsia="Droid Serif" w:hAnsi="Droid Serif"/>
-                <w:b w:val="0"/>
-                <w:bCs w:val="0"/>
-                <w:i w:val="0"/>
-                <w:iCs w:val="0"/>
-                <w:smallCaps w:val="0"/>
-                <w:strike w:val="0"/>
-                <w:color w:val="000000"/>
-                <w:sz w:val="22"/>
-                <w:szCs w:val="22"/>
-                <w:u w:val="none"/>
-                <w:shd w:fill="auto" w:val="clear"/>
-                <w:vertAlign w:val="baseline"/>
-                <w:rtl w:val="0"/>
-              </w:rPr>
-              <w:t xml:space="preserve">Questions</w:t>
               <w:tab/>
               <w:t xml:space="preserve">15</w:t>
             </w:r>
@@ -1113,7 +907,976 @@
               </w:rPr>
               <w:t xml:space="preserve">7. Étape 3 — Création du fichier docker-compose.yml et 8. Service PostgreSQL</w:t>
               <w:tab/>
-              <w:t xml:space="preserve">16</w:t>
+              <w:t xml:space="preserve">17</w:t>
+            </w:r>
+          </w:hyperlink>
+          <w:r>
+            <w:rPr>
+              <w:rtl w:val="0"/>
+            </w:rPr>
+          </w:r>
+        </w:p>
+        <w:p>
+          <w:pPr>
+            <w:tabs>
+              <w:tab w:val="right" w:leader="none" w:pos="12000"/>
+            </w:tabs>
+            <w:spacing w:before="60" w:line="240" w:lineRule="auto"/>
+            <w:rPr>
+              <w:rFonts w:ascii="Arial" w:cs="Arial" w:eastAsia="Arial" w:hAnsi="Arial"/>
+              <w:b w:val="1"/>
+              <w:bCs w:val="1"/>
+              <w:i w:val="0"/>
+              <w:iCs w:val="0"/>
+              <w:smallCaps w:val="0"/>
+              <w:strike w:val="0"/>
+              <w:color w:val="000000"/>
+              <w:sz w:val="22"/>
+              <w:szCs w:val="22"/>
+              <w:u w:val="none"/>
+              <w:shd w:fill="auto" w:val="clear"/>
+              <w:vertAlign w:val="baseline"/>
+            </w:rPr>
+          </w:pPr>
+          <w:hyperlink w:anchor="_medjuycl6rb2">
+            <w:r>
+              <w:rPr>
+                <w:rFonts w:ascii="Arial" w:cs="Arial" w:eastAsia="Arial" w:hAnsi="Arial"/>
+                <w:b w:val="1"/>
+                <w:bCs w:val="1"/>
+                <w:i w:val="0"/>
+                <w:iCs w:val="0"/>
+                <w:smallCaps w:val="0"/>
+                <w:strike w:val="0"/>
+                <w:color w:val="000000"/>
+                <w:sz w:val="22"/>
+                <w:szCs w:val="22"/>
+                <w:u w:val="none"/>
+                <w:shd w:fill="auto" w:val="clear"/>
+                <w:vertAlign w:val="baseline"/>
+                <w:rtl w:val="0"/>
+              </w:rPr>
+              <w:t xml:space="preserve">8.1 Persistance des données</w:t>
+              <w:tab/>
+              <w:t xml:space="preserve">20</w:t>
+            </w:r>
+          </w:hyperlink>
+          <w:r>
+            <w:rPr>
+              <w:rtl w:val="0"/>
+            </w:rPr>
+          </w:r>
+        </w:p>
+        <w:p>
+          <w:pPr>
+            <w:tabs>
+              <w:tab w:val="right" w:leader="none" w:pos="12000"/>
+            </w:tabs>
+            <w:spacing w:before="60" w:line="240" w:lineRule="auto"/>
+            <w:rPr>
+              <w:rFonts w:ascii="Arial" w:cs="Arial" w:eastAsia="Arial" w:hAnsi="Arial"/>
+              <w:b w:val="1"/>
+              <w:bCs w:val="1"/>
+              <w:i w:val="0"/>
+              <w:iCs w:val="0"/>
+              <w:smallCaps w:val="0"/>
+              <w:strike w:val="0"/>
+              <w:color w:val="000000"/>
+              <w:sz w:val="22"/>
+              <w:szCs w:val="22"/>
+              <w:u w:val="none"/>
+              <w:shd w:fill="auto" w:val="clear"/>
+              <w:vertAlign w:val="baseline"/>
+            </w:rPr>
+          </w:pPr>
+          <w:hyperlink w:anchor="_3nbzmyyr3gao">
+            <w:r>
+              <w:rPr>
+                <w:rFonts w:ascii="Arial Unicode MS" w:cs="Arial Unicode MS" w:eastAsia="Arial Unicode MS" w:hAnsi="Arial Unicode MS"/>
+                <w:b w:val="1"/>
+                <w:bCs w:val="1"/>
+                <w:i w:val="0"/>
+                <w:iCs w:val="0"/>
+                <w:smallCaps w:val="0"/>
+                <w:strike w:val="0"/>
+                <w:color w:val="000000"/>
+                <w:sz w:val="22"/>
+                <w:szCs w:val="22"/>
+                <w:u w:val="none"/>
+                <w:shd w:fill="auto" w:val="clear"/>
+                <w:vertAlign w:val="baseline"/>
+                <w:rtl w:val="0"/>
+              </w:rPr>
+              <w:t xml:space="preserve">9. Communication Backend → PostgreSQL</w:t>
+              <w:tab/>
+              <w:t xml:space="preserve">22</w:t>
+            </w:r>
+          </w:hyperlink>
+          <w:r>
+            <w:rPr>
+              <w:rtl w:val="0"/>
+            </w:rPr>
+          </w:r>
+        </w:p>
+        <w:p>
+          <w:pPr>
+            <w:tabs>
+              <w:tab w:val="right" w:leader="none" w:pos="12000"/>
+            </w:tabs>
+            <w:spacing w:before="60" w:line="240" w:lineRule="auto"/>
+            <w:rPr>
+              <w:rFonts w:ascii="Arial" w:cs="Arial" w:eastAsia="Arial" w:hAnsi="Arial"/>
+              <w:b w:val="1"/>
+              <w:bCs w:val="1"/>
+              <w:i w:val="0"/>
+              <w:iCs w:val="0"/>
+              <w:smallCaps w:val="0"/>
+              <w:strike w:val="0"/>
+              <w:color w:val="000000"/>
+              <w:sz w:val="22"/>
+              <w:szCs w:val="22"/>
+              <w:u w:val="none"/>
+              <w:shd w:fill="auto" w:val="clear"/>
+              <w:vertAlign w:val="baseline"/>
+            </w:rPr>
+          </w:pPr>
+          <w:hyperlink w:anchor="_3bmkebdto03h">
+            <w:r>
+              <w:rPr>
+                <w:rFonts w:ascii="Arial" w:cs="Arial" w:eastAsia="Arial" w:hAnsi="Arial"/>
+                <w:b w:val="1"/>
+                <w:bCs w:val="1"/>
+                <w:i w:val="0"/>
+                <w:iCs w:val="0"/>
+                <w:smallCaps w:val="0"/>
+                <w:strike w:val="0"/>
+                <w:color w:val="000000"/>
+                <w:sz w:val="22"/>
+                <w:szCs w:val="22"/>
+                <w:u w:val="none"/>
+                <w:shd w:fill="auto" w:val="clear"/>
+                <w:vertAlign w:val="baseline"/>
+                <w:rtl w:val="0"/>
+              </w:rPr>
+              <w:t xml:space="preserve">10. Variables d'environnement</w:t>
+              <w:tab/>
+              <w:t xml:space="preserve">23</w:t>
+            </w:r>
+          </w:hyperlink>
+          <w:r>
+            <w:rPr>
+              <w:rtl w:val="0"/>
+            </w:rPr>
+          </w:r>
+        </w:p>
+        <w:p>
+          <w:pPr>
+            <w:tabs>
+              <w:tab w:val="right" w:leader="none" w:pos="12000"/>
+            </w:tabs>
+            <w:spacing w:before="60" w:line="240" w:lineRule="auto"/>
+            <w:rPr>
+              <w:rFonts w:ascii="Arial" w:cs="Arial" w:eastAsia="Arial" w:hAnsi="Arial"/>
+              <w:b w:val="1"/>
+              <w:bCs w:val="1"/>
+              <w:i w:val="0"/>
+              <w:iCs w:val="0"/>
+              <w:smallCaps w:val="0"/>
+              <w:strike w:val="0"/>
+              <w:color w:val="000000"/>
+              <w:sz w:val="22"/>
+              <w:szCs w:val="22"/>
+              <w:u w:val="none"/>
+              <w:shd w:fill="auto" w:val="clear"/>
+              <w:vertAlign w:val="baseline"/>
+            </w:rPr>
+          </w:pPr>
+          <w:hyperlink w:anchor="_hg9wr72zjomf">
+            <w:r>
+              <w:rPr>
+                <w:rFonts w:ascii="Arial" w:cs="Arial" w:eastAsia="Arial" w:hAnsi="Arial"/>
+                <w:b w:val="1"/>
+                <w:bCs w:val="1"/>
+                <w:i w:val="0"/>
+                <w:iCs w:val="0"/>
+                <w:smallCaps w:val="0"/>
+                <w:strike w:val="0"/>
+                <w:color w:val="000000"/>
+                <w:sz w:val="22"/>
+                <w:szCs w:val="22"/>
+                <w:u w:val="none"/>
+                <w:shd w:fill="auto" w:val="clear"/>
+                <w:vertAlign w:val="baseline"/>
+                <w:rtl w:val="0"/>
+              </w:rPr>
+              <w:t xml:space="preserve">11. Dépendances entre services</w:t>
+              <w:tab/>
+              <w:t xml:space="preserve">25</w:t>
+            </w:r>
+          </w:hyperlink>
+          <w:r>
+            <w:rPr>
+              <w:rtl w:val="0"/>
+            </w:rPr>
+          </w:r>
+        </w:p>
+        <w:p>
+          <w:pPr>
+            <w:tabs>
+              <w:tab w:val="right" w:leader="none" w:pos="12000"/>
+            </w:tabs>
+            <w:spacing w:before="60" w:line="240" w:lineRule="auto"/>
+            <w:rPr>
+              <w:rFonts w:ascii="Arial" w:cs="Arial" w:eastAsia="Arial" w:hAnsi="Arial"/>
+              <w:b w:val="1"/>
+              <w:bCs w:val="1"/>
+              <w:i w:val="0"/>
+              <w:iCs w:val="0"/>
+              <w:smallCaps w:val="0"/>
+              <w:strike w:val="0"/>
+              <w:color w:val="000000"/>
+              <w:sz w:val="22"/>
+              <w:szCs w:val="22"/>
+              <w:u w:val="none"/>
+              <w:shd w:fill="auto" w:val="clear"/>
+              <w:vertAlign w:val="baseline"/>
+            </w:rPr>
+          </w:pPr>
+          <w:hyperlink w:anchor="_xjnn9lf8vyms">
+            <w:r>
+              <w:rPr>
+                <w:rFonts w:ascii="Arial" w:cs="Arial" w:eastAsia="Arial" w:hAnsi="Arial"/>
+                <w:b w:val="1"/>
+                <w:bCs w:val="1"/>
+                <w:i w:val="0"/>
+                <w:iCs w:val="0"/>
+                <w:smallCaps w:val="0"/>
+                <w:strike w:val="0"/>
+                <w:color w:val="000000"/>
+                <w:sz w:val="22"/>
+                <w:szCs w:val="22"/>
+                <w:u w:val="none"/>
+                <w:shd w:fill="auto" w:val="clear"/>
+                <w:vertAlign w:val="baseline"/>
+                <w:rtl w:val="0"/>
+              </w:rPr>
+              <w:t xml:space="preserve">12. Réseau Docker Compose</w:t>
+              <w:tab/>
+              <w:t xml:space="preserve">26</w:t>
+            </w:r>
+          </w:hyperlink>
+          <w:r>
+            <w:rPr>
+              <w:rtl w:val="0"/>
+            </w:rPr>
+          </w:r>
+        </w:p>
+        <w:p>
+          <w:pPr>
+            <w:tabs>
+              <w:tab w:val="right" w:leader="none" w:pos="12000"/>
+            </w:tabs>
+            <w:spacing w:before="60" w:line="240" w:lineRule="auto"/>
+            <w:rPr>
+              <w:rFonts w:ascii="Arial" w:cs="Arial" w:eastAsia="Arial" w:hAnsi="Arial"/>
+              <w:b w:val="1"/>
+              <w:bCs w:val="1"/>
+              <w:i w:val="0"/>
+              <w:iCs w:val="0"/>
+              <w:smallCaps w:val="0"/>
+              <w:strike w:val="0"/>
+              <w:color w:val="000000"/>
+              <w:sz w:val="22"/>
+              <w:szCs w:val="22"/>
+              <w:u w:val="none"/>
+              <w:shd w:fill="auto" w:val="clear"/>
+              <w:vertAlign w:val="baseline"/>
+            </w:rPr>
+          </w:pPr>
+          <w:hyperlink w:anchor="_fcahx7jy5jmx">
+            <w:r>
+              <w:rPr>
+                <w:rFonts w:ascii="Arial" w:cs="Arial" w:eastAsia="Arial" w:hAnsi="Arial"/>
+                <w:b w:val="1"/>
+                <w:bCs w:val="1"/>
+                <w:i w:val="0"/>
+                <w:iCs w:val="0"/>
+                <w:smallCaps w:val="0"/>
+                <w:strike w:val="0"/>
+                <w:color w:val="000000"/>
+                <w:sz w:val="22"/>
+                <w:szCs w:val="22"/>
+                <w:u w:val="none"/>
+                <w:shd w:fill="auto" w:val="clear"/>
+                <w:vertAlign w:val="baseline"/>
+                <w:rtl w:val="0"/>
+              </w:rPr>
+              <w:t xml:space="preserve">13. Publication des ports</w:t>
+              <w:tab/>
+              <w:t xml:space="preserve">29</w:t>
+            </w:r>
+          </w:hyperlink>
+          <w:r>
+            <w:rPr>
+              <w:rtl w:val="0"/>
+            </w:rPr>
+          </w:r>
+        </w:p>
+        <w:p>
+          <w:pPr>
+            <w:tabs>
+              <w:tab w:val="right" w:leader="none" w:pos="12000"/>
+            </w:tabs>
+            <w:spacing w:before="60" w:line="240" w:lineRule="auto"/>
+            <w:rPr>
+              <w:rFonts w:ascii="Arial" w:cs="Arial" w:eastAsia="Arial" w:hAnsi="Arial"/>
+              <w:b w:val="1"/>
+              <w:bCs w:val="1"/>
+              <w:i w:val="0"/>
+              <w:iCs w:val="0"/>
+              <w:smallCaps w:val="0"/>
+              <w:strike w:val="0"/>
+              <w:color w:val="000000"/>
+              <w:sz w:val="22"/>
+              <w:szCs w:val="22"/>
+              <w:u w:val="none"/>
+              <w:shd w:fill="auto" w:val="clear"/>
+              <w:vertAlign w:val="baseline"/>
+            </w:rPr>
+          </w:pPr>
+          <w:hyperlink w:anchor="_tgmwthuez3qo">
+            <w:r>
+              <w:rPr>
+                <w:rFonts w:ascii="Arial" w:cs="Arial" w:eastAsia="Arial" w:hAnsi="Arial"/>
+                <w:b w:val="1"/>
+                <w:bCs w:val="1"/>
+                <w:i w:val="0"/>
+                <w:iCs w:val="0"/>
+                <w:smallCaps w:val="0"/>
+                <w:strike w:val="0"/>
+                <w:color w:val="000000"/>
+                <w:sz w:val="22"/>
+                <w:szCs w:val="22"/>
+                <w:u w:val="none"/>
+                <w:shd w:fill="auto" w:val="clear"/>
+                <w:vertAlign w:val="baseline"/>
+                <w:rtl w:val="0"/>
+              </w:rPr>
+              <w:t xml:space="preserve">14. Étape 4 — Démarrage de l'environnement</w:t>
+              <w:tab/>
+              <w:t xml:space="preserve">31</w:t>
+            </w:r>
+          </w:hyperlink>
+          <w:r>
+            <w:rPr>
+              <w:rtl w:val="0"/>
+            </w:rPr>
+          </w:r>
+        </w:p>
+        <w:p>
+          <w:pPr>
+            <w:tabs>
+              <w:tab w:val="right" w:leader="none" w:pos="12000"/>
+            </w:tabs>
+            <w:spacing w:before="60" w:line="240" w:lineRule="auto"/>
+            <w:rPr>
+              <w:rFonts w:ascii="Arial" w:cs="Arial" w:eastAsia="Arial" w:hAnsi="Arial"/>
+              <w:b w:val="1"/>
+              <w:bCs w:val="1"/>
+              <w:i w:val="0"/>
+              <w:iCs w:val="0"/>
+              <w:smallCaps w:val="0"/>
+              <w:strike w:val="0"/>
+              <w:color w:val="000000"/>
+              <w:sz w:val="22"/>
+              <w:szCs w:val="22"/>
+              <w:u w:val="none"/>
+              <w:shd w:fill="auto" w:val="clear"/>
+              <w:vertAlign w:val="baseline"/>
+            </w:rPr>
+          </w:pPr>
+          <w:hyperlink w:anchor="_a7u10qz1ienw">
+            <w:r>
+              <w:rPr>
+                <w:rFonts w:ascii="Arial" w:cs="Arial" w:eastAsia="Arial" w:hAnsi="Arial"/>
+                <w:b w:val="1"/>
+                <w:bCs w:val="1"/>
+                <w:i w:val="0"/>
+                <w:iCs w:val="0"/>
+                <w:smallCaps w:val="0"/>
+                <w:strike w:val="0"/>
+                <w:color w:val="000000"/>
+                <w:sz w:val="22"/>
+                <w:szCs w:val="22"/>
+                <w:u w:val="none"/>
+                <w:shd w:fill="auto" w:val="clear"/>
+                <w:vertAlign w:val="baseline"/>
+                <w:rtl w:val="0"/>
+              </w:rPr>
+              <w:t xml:space="preserve">15. Tests fonctionnels</w:t>
+              <w:tab/>
+              <w:t xml:space="preserve">32</w:t>
+            </w:r>
+          </w:hyperlink>
+          <w:r>
+            <w:rPr>
+              <w:rtl w:val="0"/>
+            </w:rPr>
+          </w:r>
+        </w:p>
+        <w:p>
+          <w:pPr>
+            <w:tabs>
+              <w:tab w:val="right" w:leader="none" w:pos="12000"/>
+            </w:tabs>
+            <w:spacing w:before="60" w:line="240" w:lineRule="auto"/>
+            <w:rPr>
+              <w:rFonts w:ascii="Arial" w:cs="Arial" w:eastAsia="Arial" w:hAnsi="Arial"/>
+              <w:b w:val="1"/>
+              <w:bCs w:val="1"/>
+              <w:i w:val="0"/>
+              <w:iCs w:val="0"/>
+              <w:smallCaps w:val="0"/>
+              <w:strike w:val="0"/>
+              <w:color w:val="000000"/>
+              <w:sz w:val="22"/>
+              <w:szCs w:val="22"/>
+              <w:u w:val="none"/>
+              <w:shd w:fill="auto" w:val="clear"/>
+              <w:vertAlign w:val="baseline"/>
+            </w:rPr>
+          </w:pPr>
+          <w:hyperlink w:anchor="_g4rty3itvdkq">
+            <w:r>
+              <w:rPr>
+                <w:rFonts w:ascii="Arial" w:cs="Arial" w:eastAsia="Arial" w:hAnsi="Arial"/>
+                <w:b w:val="1"/>
+                <w:bCs w:val="1"/>
+                <w:i w:val="0"/>
+                <w:iCs w:val="0"/>
+                <w:smallCaps w:val="0"/>
+                <w:strike w:val="0"/>
+                <w:color w:val="000000"/>
+                <w:sz w:val="22"/>
+                <w:szCs w:val="22"/>
+                <w:u w:val="none"/>
+                <w:shd w:fill="auto" w:val="clear"/>
+                <w:vertAlign w:val="baseline"/>
+                <w:rtl w:val="0"/>
+              </w:rPr>
+              <w:t xml:space="preserve">16. Analyse des logs</w:t>
+              <w:tab/>
+              <w:t xml:space="preserve">33</w:t>
+            </w:r>
+          </w:hyperlink>
+          <w:r>
+            <w:rPr>
+              <w:rtl w:val="0"/>
+            </w:rPr>
+          </w:r>
+        </w:p>
+        <w:p>
+          <w:pPr>
+            <w:tabs>
+              <w:tab w:val="right" w:leader="none" w:pos="12000"/>
+            </w:tabs>
+            <w:spacing w:before="60" w:line="240" w:lineRule="auto"/>
+            <w:rPr>
+              <w:rFonts w:ascii="Arial" w:cs="Arial" w:eastAsia="Arial" w:hAnsi="Arial"/>
+              <w:b w:val="1"/>
+              <w:bCs w:val="1"/>
+              <w:i w:val="0"/>
+              <w:iCs w:val="0"/>
+              <w:smallCaps w:val="0"/>
+              <w:strike w:val="0"/>
+              <w:color w:val="000000"/>
+              <w:sz w:val="22"/>
+              <w:szCs w:val="22"/>
+              <w:u w:val="none"/>
+              <w:shd w:fill="auto" w:val="clear"/>
+              <w:vertAlign w:val="baseline"/>
+            </w:rPr>
+          </w:pPr>
+          <w:hyperlink w:anchor="_rvrqawbwd765">
+            <w:r>
+              <w:rPr>
+                <w:rFonts w:ascii="Arial" w:cs="Arial" w:eastAsia="Arial" w:hAnsi="Arial"/>
+                <w:b w:val="1"/>
+                <w:bCs w:val="1"/>
+                <w:i w:val="0"/>
+                <w:iCs w:val="0"/>
+                <w:smallCaps w:val="0"/>
+                <w:strike w:val="0"/>
+                <w:color w:val="000000"/>
+                <w:sz w:val="22"/>
+                <w:szCs w:val="22"/>
+                <w:u w:val="none"/>
+                <w:shd w:fill="auto" w:val="clear"/>
+                <w:vertAlign w:val="baseline"/>
+                <w:rtl w:val="0"/>
+              </w:rPr>
+              <w:t xml:space="preserve">17. Diagnostic depuis les conteneurs</w:t>
+              <w:tab/>
+              <w:t xml:space="preserve">34</w:t>
+            </w:r>
+          </w:hyperlink>
+          <w:r>
+            <w:rPr>
+              <w:rtl w:val="0"/>
+            </w:rPr>
+          </w:r>
+        </w:p>
+        <w:p>
+          <w:pPr>
+            <w:tabs>
+              <w:tab w:val="right" w:leader="none" w:pos="12000"/>
+            </w:tabs>
+            <w:spacing w:before="60" w:line="240" w:lineRule="auto"/>
+            <w:rPr>
+              <w:rFonts w:ascii="Arial" w:cs="Arial" w:eastAsia="Arial" w:hAnsi="Arial"/>
+              <w:b w:val="1"/>
+              <w:bCs w:val="1"/>
+              <w:i w:val="0"/>
+              <w:iCs w:val="0"/>
+              <w:smallCaps w:val="0"/>
+              <w:strike w:val="0"/>
+              <w:color w:val="000000"/>
+              <w:sz w:val="22"/>
+              <w:szCs w:val="22"/>
+              <w:u w:val="none"/>
+              <w:shd w:fill="auto" w:val="clear"/>
+              <w:vertAlign w:val="baseline"/>
+            </w:rPr>
+          </w:pPr>
+          <w:hyperlink w:anchor="_uwkbsddvkbwc">
+            <w:r>
+              <w:rPr>
+                <w:rFonts w:ascii="Arial" w:cs="Arial" w:eastAsia="Arial" w:hAnsi="Arial"/>
+                <w:b w:val="1"/>
+                <w:bCs w:val="1"/>
+                <w:i w:val="0"/>
+                <w:iCs w:val="0"/>
+                <w:smallCaps w:val="0"/>
+                <w:strike w:val="0"/>
+                <w:color w:val="000000"/>
+                <w:sz w:val="22"/>
+                <w:szCs w:val="22"/>
+                <w:u w:val="none"/>
+                <w:shd w:fill="auto" w:val="clear"/>
+                <w:vertAlign w:val="baseline"/>
+                <w:rtl w:val="0"/>
+              </w:rPr>
+              <w:t xml:space="preserve">18. Arrêt et nettoyage</w:t>
+              <w:tab/>
+              <w:t xml:space="preserve">35</w:t>
+            </w:r>
+          </w:hyperlink>
+          <w:r>
+            <w:rPr>
+              <w:rtl w:val="0"/>
+            </w:rPr>
+          </w:r>
+        </w:p>
+        <w:p>
+          <w:pPr>
+            <w:tabs>
+              <w:tab w:val="right" w:leader="none" w:pos="12000"/>
+            </w:tabs>
+            <w:spacing w:before="60" w:line="240" w:lineRule="auto"/>
+            <w:rPr>
+              <w:rFonts w:ascii="Arial" w:cs="Arial" w:eastAsia="Arial" w:hAnsi="Arial"/>
+              <w:b w:val="1"/>
+              <w:bCs w:val="1"/>
+              <w:i w:val="0"/>
+              <w:iCs w:val="0"/>
+              <w:smallCaps w:val="0"/>
+              <w:strike w:val="0"/>
+              <w:color w:val="000000"/>
+              <w:sz w:val="22"/>
+              <w:szCs w:val="22"/>
+              <w:u w:val="none"/>
+              <w:shd w:fill="auto" w:val="clear"/>
+              <w:vertAlign w:val="baseline"/>
+            </w:rPr>
+          </w:pPr>
+          <w:hyperlink w:anchor="_lejha6ihbzbi">
+            <w:r>
+              <w:rPr>
+                <w:rFonts w:ascii="Arial" w:cs="Arial" w:eastAsia="Arial" w:hAnsi="Arial"/>
+                <w:b w:val="1"/>
+                <w:bCs w:val="1"/>
+                <w:i w:val="0"/>
+                <w:iCs w:val="0"/>
+                <w:smallCaps w:val="0"/>
+                <w:strike w:val="0"/>
+                <w:color w:val="000000"/>
+                <w:sz w:val="22"/>
+                <w:szCs w:val="22"/>
+                <w:u w:val="none"/>
+                <w:shd w:fill="auto" w:val="clear"/>
+                <w:vertAlign w:val="baseline"/>
+                <w:rtl w:val="0"/>
+              </w:rPr>
+              <w:t xml:space="preserve">19. Bonus — Healthcheck PostgreSQL</w:t>
+              <w:tab/>
+              <w:t xml:space="preserve">37</w:t>
+            </w:r>
+          </w:hyperlink>
+          <w:r>
+            <w:rPr>
+              <w:rtl w:val="0"/>
+            </w:rPr>
+          </w:r>
+        </w:p>
+        <w:p>
+          <w:pPr>
+            <w:tabs>
+              <w:tab w:val="right" w:leader="none" w:pos="12000"/>
+            </w:tabs>
+            <w:spacing w:before="60" w:line="240" w:lineRule="auto"/>
+            <w:rPr>
+              <w:rFonts w:ascii="Arial" w:cs="Arial" w:eastAsia="Arial" w:hAnsi="Arial"/>
+              <w:b w:val="1"/>
+              <w:bCs w:val="1"/>
+              <w:i w:val="0"/>
+              <w:iCs w:val="0"/>
+              <w:smallCaps w:val="0"/>
+              <w:strike w:val="0"/>
+              <w:color w:val="000000"/>
+              <w:sz w:val="22"/>
+              <w:szCs w:val="22"/>
+              <w:u w:val="none"/>
+              <w:shd w:fill="auto" w:val="clear"/>
+              <w:vertAlign w:val="baseline"/>
+            </w:rPr>
+          </w:pPr>
+          <w:hyperlink w:anchor="_o6yueqwy9bm2">
+            <w:r>
+              <w:rPr>
+                <w:rFonts w:ascii="Arial" w:cs="Arial" w:eastAsia="Arial" w:hAnsi="Arial"/>
+                <w:b w:val="1"/>
+                <w:bCs w:val="1"/>
+                <w:i w:val="0"/>
+                <w:iCs w:val="0"/>
+                <w:smallCaps w:val="0"/>
+                <w:strike w:val="0"/>
+                <w:color w:val="000000"/>
+                <w:sz w:val="22"/>
+                <w:szCs w:val="22"/>
+                <w:u w:val="none"/>
+                <w:shd w:fill="auto" w:val="clear"/>
+                <w:vertAlign w:val="baseline"/>
+                <w:rtl w:val="0"/>
+              </w:rPr>
+              <w:t xml:space="preserve">20. Bonus — Limiter l'accès aux services</w:t>
+              <w:tab/>
+              <w:t xml:space="preserve">37</w:t>
+            </w:r>
+          </w:hyperlink>
+          <w:r>
+            <w:rPr>
+              <w:rtl w:val="0"/>
+            </w:rPr>
+          </w:r>
+        </w:p>
+        <w:p>
+          <w:pPr>
+            <w:tabs>
+              <w:tab w:val="right" w:leader="none" w:pos="12000"/>
+            </w:tabs>
+            <w:spacing w:before="60" w:line="240" w:lineRule="auto"/>
+            <w:rPr>
+              <w:rFonts w:ascii="Arial" w:cs="Arial" w:eastAsia="Arial" w:hAnsi="Arial"/>
+              <w:b w:val="1"/>
+              <w:bCs w:val="1"/>
+              <w:i w:val="0"/>
+              <w:iCs w:val="0"/>
+              <w:smallCaps w:val="0"/>
+              <w:strike w:val="0"/>
+              <w:color w:val="000000"/>
+              <w:sz w:val="22"/>
+              <w:szCs w:val="22"/>
+              <w:u w:val="none"/>
+              <w:shd w:fill="auto" w:val="clear"/>
+              <w:vertAlign w:val="baseline"/>
+            </w:rPr>
+          </w:pPr>
+          <w:hyperlink w:anchor="_pgh6maw1veuw">
+            <w:r>
+              <w:rPr>
+                <w:rFonts w:ascii="Arial" w:cs="Arial" w:eastAsia="Arial" w:hAnsi="Arial"/>
+                <w:b w:val="1"/>
+                <w:bCs w:val="1"/>
+                <w:i w:val="0"/>
+                <w:iCs w:val="0"/>
+                <w:smallCaps w:val="0"/>
+                <w:strike w:val="0"/>
+                <w:color w:val="000000"/>
+                <w:sz w:val="22"/>
+                <w:szCs w:val="22"/>
+                <w:u w:val="none"/>
+                <w:shd w:fill="auto" w:val="clear"/>
+                <w:vertAlign w:val="baseline"/>
+                <w:rtl w:val="0"/>
+              </w:rPr>
+              <w:t xml:space="preserve">21. Bonus — .dockerignore</w:t>
+              <w:tab/>
+              <w:t xml:space="preserve">38</w:t>
+            </w:r>
+          </w:hyperlink>
+          <w:r>
+            <w:rPr>
+              <w:rtl w:val="0"/>
+            </w:rPr>
+          </w:r>
+        </w:p>
+        <w:p>
+          <w:pPr>
+            <w:tabs>
+              <w:tab w:val="right" w:leader="none" w:pos="12000"/>
+            </w:tabs>
+            <w:spacing w:before="60" w:line="240" w:lineRule="auto"/>
+            <w:rPr>
+              <w:rFonts w:ascii="Arial" w:cs="Arial" w:eastAsia="Arial" w:hAnsi="Arial"/>
+              <w:b w:val="1"/>
+              <w:bCs w:val="1"/>
+              <w:i w:val="0"/>
+              <w:iCs w:val="0"/>
+              <w:smallCaps w:val="0"/>
+              <w:strike w:val="0"/>
+              <w:color w:val="000000"/>
+              <w:sz w:val="22"/>
+              <w:szCs w:val="22"/>
+              <w:u w:val="none"/>
+              <w:shd w:fill="auto" w:val="clear"/>
+              <w:vertAlign w:val="baseline"/>
+            </w:rPr>
+          </w:pPr>
+          <w:hyperlink w:anchor="_n06u0zgjjfie">
+            <w:r>
+              <w:rPr>
+                <w:rFonts w:ascii="Arial" w:cs="Arial" w:eastAsia="Arial" w:hAnsi="Arial"/>
+                <w:b w:val="1"/>
+                <w:bCs w:val="1"/>
+                <w:i w:val="0"/>
+                <w:iCs w:val="0"/>
+                <w:smallCaps w:val="0"/>
+                <w:strike w:val="0"/>
+                <w:color w:val="000000"/>
+                <w:sz w:val="22"/>
+                <w:szCs w:val="22"/>
+                <w:u w:val="none"/>
+                <w:shd w:fill="auto" w:val="clear"/>
+                <w:vertAlign w:val="baseline"/>
+                <w:rtl w:val="0"/>
+              </w:rPr>
+              <w:t xml:space="preserve">22. Commandes utiles</w:t>
+              <w:tab/>
+              <w:t xml:space="preserve">39</w:t>
+            </w:r>
+          </w:hyperlink>
+          <w:r>
+            <w:rPr>
+              <w:rtl w:val="0"/>
+            </w:rPr>
+          </w:r>
+        </w:p>
+        <w:p>
+          <w:pPr>
+            <w:tabs>
+              <w:tab w:val="right" w:leader="none" w:pos="12000"/>
+            </w:tabs>
+            <w:spacing w:before="60" w:line="240" w:lineRule="auto"/>
+            <w:rPr>
+              <w:rFonts w:ascii="Arial" w:cs="Arial" w:eastAsia="Arial" w:hAnsi="Arial"/>
+              <w:b w:val="1"/>
+              <w:bCs w:val="1"/>
+              <w:i w:val="0"/>
+              <w:iCs w:val="0"/>
+              <w:smallCaps w:val="0"/>
+              <w:strike w:val="0"/>
+              <w:color w:val="000000"/>
+              <w:sz w:val="22"/>
+              <w:szCs w:val="22"/>
+              <w:u w:val="none"/>
+              <w:shd w:fill="auto" w:val="clear"/>
+              <w:vertAlign w:val="baseline"/>
+            </w:rPr>
+          </w:pPr>
+          <w:hyperlink w:anchor="_bu5zjqvwh4mq">
+            <w:r>
+              <w:rPr>
+                <w:rFonts w:ascii="Arial" w:cs="Arial" w:eastAsia="Arial" w:hAnsi="Arial"/>
+                <w:b w:val="1"/>
+                <w:bCs w:val="1"/>
+                <w:i w:val="0"/>
+                <w:iCs w:val="0"/>
+                <w:smallCaps w:val="0"/>
+                <w:strike w:val="0"/>
+                <w:color w:val="000000"/>
+                <w:sz w:val="22"/>
+                <w:szCs w:val="22"/>
+                <w:u w:val="none"/>
+                <w:shd w:fill="auto" w:val="clear"/>
+                <w:vertAlign w:val="baseline"/>
+                <w:rtl w:val="0"/>
+              </w:rPr>
+              <w:t xml:space="preserve">23. Résultat attendu</w:t>
+              <w:tab/>
+              <w:t xml:space="preserve">40</w:t>
+            </w:r>
+          </w:hyperlink>
+          <w:r>
+            <w:rPr>
+              <w:rtl w:val="0"/>
+            </w:rPr>
+          </w:r>
+        </w:p>
+        <w:p>
+          <w:pPr>
+            <w:tabs>
+              <w:tab w:val="right" w:leader="none" w:pos="12000"/>
+            </w:tabs>
+            <w:spacing w:before="60" w:line="240" w:lineRule="auto"/>
+            <w:rPr>
+              <w:rFonts w:ascii="Arial" w:cs="Arial" w:eastAsia="Arial" w:hAnsi="Arial"/>
+              <w:b w:val="1"/>
+              <w:bCs w:val="1"/>
+              <w:i w:val="0"/>
+              <w:iCs w:val="0"/>
+              <w:smallCaps w:val="0"/>
+              <w:strike w:val="0"/>
+              <w:color w:val="000000"/>
+              <w:sz w:val="22"/>
+              <w:szCs w:val="22"/>
+              <w:u w:val="none"/>
+              <w:shd w:fill="auto" w:val="clear"/>
+              <w:vertAlign w:val="baseline"/>
+            </w:rPr>
+          </w:pPr>
+          <w:hyperlink w:anchor="_ylomo8szn6fk">
+            <w:r>
+              <w:rPr>
+                <w:rFonts w:ascii="Arial" w:cs="Arial" w:eastAsia="Arial" w:hAnsi="Arial"/>
+                <w:b w:val="1"/>
+                <w:bCs w:val="1"/>
+                <w:i w:val="0"/>
+                <w:iCs w:val="0"/>
+                <w:smallCaps w:val="0"/>
+                <w:strike w:val="0"/>
+                <w:color w:val="000000"/>
+                <w:sz w:val="22"/>
+                <w:szCs w:val="22"/>
+                <w:u w:val="none"/>
+                <w:shd w:fill="auto" w:val="clear"/>
+                <w:vertAlign w:val="baseline"/>
+                <w:rtl w:val="0"/>
+              </w:rPr>
+              <w:t xml:space="preserve">24. Livrable attendu</w:t>
+              <w:tab/>
+              <w:t xml:space="preserve">41</w:t>
+            </w:r>
+          </w:hyperlink>
+          <w:r>
+            <w:rPr>
+              <w:rtl w:val="0"/>
+            </w:rPr>
+          </w:r>
+        </w:p>
+        <w:p>
+          <w:pPr>
+            <w:tabs>
+              <w:tab w:val="right" w:leader="none" w:pos="12000"/>
+            </w:tabs>
+            <w:spacing w:before="60" w:line="240" w:lineRule="auto"/>
+            <w:rPr>
+              <w:rFonts w:ascii="Arial" w:cs="Arial" w:eastAsia="Arial" w:hAnsi="Arial"/>
+              <w:b w:val="1"/>
+              <w:bCs w:val="1"/>
+              <w:i w:val="0"/>
+              <w:iCs w:val="0"/>
+              <w:smallCaps w:val="0"/>
+              <w:strike w:val="0"/>
+              <w:color w:val="000000"/>
+              <w:sz w:val="22"/>
+              <w:szCs w:val="22"/>
+              <w:u w:val="none"/>
+              <w:shd w:fill="auto" w:val="clear"/>
+              <w:vertAlign w:val="baseline"/>
+            </w:rPr>
+          </w:pPr>
+          <w:hyperlink w:anchor="_1rs4vzyndt0o">
+            <w:r>
+              <w:rPr>
+                <w:rFonts w:ascii="Arial" w:cs="Arial" w:eastAsia="Arial" w:hAnsi="Arial"/>
+                <w:b w:val="1"/>
+                <w:bCs w:val="1"/>
+                <w:i w:val="0"/>
+                <w:iCs w:val="0"/>
+                <w:smallCaps w:val="0"/>
+                <w:strike w:val="0"/>
+                <w:color w:val="000000"/>
+                <w:sz w:val="22"/>
+                <w:szCs w:val="22"/>
+                <w:u w:val="none"/>
+                <w:shd w:fill="auto" w:val="clear"/>
+                <w:vertAlign w:val="baseline"/>
+                <w:rtl w:val="0"/>
+              </w:rPr>
+              <w:t xml:space="preserve">25. Critères de validation</w:t>
+              <w:tab/>
+              <w:t xml:space="preserve">42</w:t>
+            </w:r>
+          </w:hyperlink>
+          <w:r>
+            <w:rPr>
+              <w:rtl w:val="0"/>
+            </w:rPr>
+          </w:r>
+        </w:p>
+        <w:p>
+          <w:pPr>
+            <w:tabs>
+              <w:tab w:val="right" w:leader="none" w:pos="12000"/>
+            </w:tabs>
+            <w:spacing w:before="60" w:line="240" w:lineRule="auto"/>
+            <w:rPr>
+              <w:rFonts w:ascii="Arial" w:cs="Arial" w:eastAsia="Arial" w:hAnsi="Arial"/>
+              <w:b w:val="1"/>
+              <w:bCs w:val="1"/>
+              <w:i w:val="0"/>
+              <w:iCs w:val="0"/>
+              <w:smallCaps w:val="0"/>
+              <w:strike w:val="0"/>
+              <w:color w:val="000000"/>
+              <w:sz w:val="22"/>
+              <w:szCs w:val="22"/>
+              <w:u w:val="none"/>
+              <w:shd w:fill="auto" w:val="clear"/>
+              <w:vertAlign w:val="baseline"/>
+            </w:rPr>
+          </w:pPr>
+          <w:hyperlink w:anchor="_8k3vjzvoh864">
+            <w:r>
+              <w:rPr>
+                <w:rFonts w:ascii="Arial" w:cs="Arial" w:eastAsia="Arial" w:hAnsi="Arial"/>
+                <w:b w:val="1"/>
+                <w:bCs w:val="1"/>
+                <w:i w:val="0"/>
+                <w:iCs w:val="0"/>
+                <w:smallCaps w:val="0"/>
+                <w:strike w:val="0"/>
+                <w:color w:val="000000"/>
+                <w:sz w:val="22"/>
+                <w:szCs w:val="22"/>
+                <w:u w:val="none"/>
+                <w:shd w:fill="auto" w:val="clear"/>
+                <w:vertAlign w:val="baseline"/>
+                <w:rtl w:val="0"/>
+              </w:rPr>
+              <w:t xml:space="preserve">26. Questions de synthèse</w:t>
+              <w:tab/>
+              <w:t xml:space="preserve">42</w:t>
             </w:r>
           </w:hyperlink>
           <w:r>
@@ -1746,12 +2509,12 @@
           <wp:inline distB="114300" distT="114300" distL="114300" distR="114300">
             <wp:extent cx="1824038" cy="3628031"/>
             <wp:effectExtent b="0" l="0" r="0" t="0"/>
-            <wp:docPr id="26" name="image38.png"/>
+            <wp:docPr id="25" name="image39.png"/>
             <a:graphic>
               <a:graphicData uri="http://schemas.openxmlformats.org/drawingml/2006/picture">
                 <pic:pic>
                   <pic:nvPicPr>
-                    <pic:cNvPr id="0" name="image38.png"/>
+                    <pic:cNvPr id="0" name="image39.png"/>
                     <pic:cNvPicPr preferRelativeResize="0"/>
                   </pic:nvPicPr>
                   <pic:blipFill>
@@ -1925,12 +2688,12 @@
           <wp:inline distB="114300" distT="114300" distL="114300" distR="114300">
             <wp:extent cx="1647825" cy="3009900"/>
             <wp:effectExtent b="0" l="0" r="0" t="0"/>
-            <wp:docPr id="4" name="image15.png"/>
+            <wp:docPr id="4" name="image40.png"/>
             <a:graphic>
               <a:graphicData uri="http://schemas.openxmlformats.org/drawingml/2006/picture">
                 <pic:pic>
                   <pic:nvPicPr>
-                    <pic:cNvPr id="0" name="image15.png"/>
+                    <pic:cNvPr id="0" name="image40.png"/>
                     <pic:cNvPicPr preferRelativeResize="0"/>
                   </pic:nvPicPr>
                   <pic:blipFill>
@@ -2026,12 +2789,12 @@
           <wp:inline distB="114300" distT="114300" distL="114300" distR="114300">
             <wp:extent cx="4666296" cy="4030663"/>
             <wp:effectExtent b="0" l="0" r="0" t="0"/>
-            <wp:docPr id="51" name="image54.png"/>
+            <wp:docPr id="50" name="image45.png"/>
             <a:graphic>
               <a:graphicData uri="http://schemas.openxmlformats.org/drawingml/2006/picture">
                 <pic:pic>
                   <pic:nvPicPr>
-                    <pic:cNvPr id="0" name="image54.png"/>
+                    <pic:cNvPr id="0" name="image45.png"/>
                     <pic:cNvPicPr preferRelativeResize="0"/>
                   </pic:nvPicPr>
                   <pic:blipFill>
@@ -2313,12 +3076,12 @@
           <wp:inline distB="114300" distT="114300" distL="114300" distR="114300">
             <wp:extent cx="1409700" cy="2152650"/>
             <wp:effectExtent b="0" l="0" r="0" t="0"/>
-            <wp:docPr id="46" name="image46.png"/>
+            <wp:docPr id="45" name="image43.png"/>
             <a:graphic>
               <a:graphicData uri="http://schemas.openxmlformats.org/drawingml/2006/picture">
                 <pic:pic>
                   <pic:nvPicPr>
-                    <pic:cNvPr id="0" name="image46.png"/>
+                    <pic:cNvPr id="0" name="image43.png"/>
                     <pic:cNvPicPr preferRelativeResize="0"/>
                   </pic:nvPicPr>
                   <pic:blipFill>
@@ -2401,12 +3164,12 @@
           <wp:inline distB="114300" distT="114300" distL="114300" distR="114300">
             <wp:extent cx="5943600" cy="2527300"/>
             <wp:effectExtent b="0" l="0" r="0" t="0"/>
-            <wp:docPr id="43" name="image56.png"/>
+            <wp:docPr id="42" name="image29.png"/>
             <a:graphic>
               <a:graphicData uri="http://schemas.openxmlformats.org/drawingml/2006/picture">
                 <pic:pic>
                   <pic:nvPicPr>
-                    <pic:cNvPr id="0" name="image56.png"/>
+                    <pic:cNvPr id="0" name="image29.png"/>
                     <pic:cNvPicPr preferRelativeResize="0"/>
                   </pic:nvPicPr>
                   <pic:blipFill>
@@ -2465,12 +3228,12 @@
           <wp:inline distB="114300" distT="114300" distL="114300" distR="114300">
             <wp:extent cx="5943600" cy="1939925"/>
             <wp:effectExtent b="0" l="0" r="0" t="0"/>
-            <wp:docPr id="55" name="image51.png"/>
+            <wp:docPr id="55" name="image48.png"/>
             <a:graphic>
               <a:graphicData uri="http://schemas.openxmlformats.org/drawingml/2006/picture">
                 <pic:pic>
                   <pic:nvPicPr>
-                    <pic:cNvPr id="0" name="image51.png"/>
+                    <pic:cNvPr id="0" name="image48.png"/>
                     <pic:cNvPicPr preferRelativeResize="0"/>
                   </pic:nvPicPr>
                   <pic:blipFill>
@@ -2529,12 +3292,12 @@
           <wp:inline distB="114300" distT="114300" distL="114300" distR="114300">
             <wp:extent cx="5553075" cy="1543050"/>
             <wp:effectExtent b="25400" l="25400" r="25400" t="25400"/>
-            <wp:docPr id="35" name="image36.png"/>
+            <wp:docPr id="34" name="image50.png"/>
             <a:graphic>
               <a:graphicData uri="http://schemas.openxmlformats.org/drawingml/2006/picture">
                 <pic:pic>
                   <pic:nvPicPr>
-                    <pic:cNvPr id="0" name="image36.png"/>
+                    <pic:cNvPr id="0" name="image50.png"/>
                     <pic:cNvPicPr preferRelativeResize="0"/>
                   </pic:nvPicPr>
                   <pic:blipFill>
@@ -2822,12 +3585,12 @@
           <wp:inline distB="114300" distT="114300" distL="114300" distR="114300">
             <wp:extent cx="4695825" cy="3376962"/>
             <wp:effectExtent b="0" l="0" r="0" t="0"/>
-            <wp:docPr id="25" name="image34.png"/>
+            <wp:docPr id="24" name="image15.png"/>
             <a:graphic>
               <a:graphicData uri="http://schemas.openxmlformats.org/drawingml/2006/picture">
                 <pic:pic>
                   <pic:nvPicPr>
-                    <pic:cNvPr id="0" name="image34.png"/>
+                    <pic:cNvPr id="0" name="image15.png"/>
                     <pic:cNvPicPr preferRelativeResize="0"/>
                   </pic:nvPicPr>
                   <pic:blipFill>
@@ -3123,12 +3886,12 @@
           <wp:inline distB="114300" distT="114300" distL="114300" distR="114300">
             <wp:extent cx="5943600" cy="2171700"/>
             <wp:effectExtent b="0" l="0" r="0" t="0"/>
-            <wp:docPr id="9" name="image11.png"/>
+            <wp:docPr id="9" name="image2.png"/>
             <a:graphic>
               <a:graphicData uri="http://schemas.openxmlformats.org/drawingml/2006/picture">
                 <pic:pic>
                   <pic:nvPicPr>
-                    <pic:cNvPr id="0" name="image11.png"/>
+                    <pic:cNvPr id="0" name="image2.png"/>
                     <pic:cNvPicPr preferRelativeResize="0"/>
                   </pic:nvPicPr>
                   <pic:blipFill>
@@ -3177,12 +3940,12 @@
           <wp:inline distB="114300" distT="114300" distL="114300" distR="114300">
             <wp:extent cx="5943600" cy="292100"/>
             <wp:effectExtent b="0" l="0" r="0" t="0"/>
-            <wp:docPr id="36" name="image35.png"/>
+            <wp:docPr id="35" name="image46.png"/>
             <a:graphic>
               <a:graphicData uri="http://schemas.openxmlformats.org/drawingml/2006/picture">
                 <pic:pic>
                   <pic:nvPicPr>
-                    <pic:cNvPr id="0" name="image35.png"/>
+                    <pic:cNvPr id="0" name="image46.png"/>
                     <pic:cNvPicPr preferRelativeResize="0"/>
                   </pic:nvPicPr>
                   <pic:blipFill>
@@ -3244,12 +4007,12 @@
           <wp:inline distB="114300" distT="114300" distL="114300" distR="114300">
             <wp:extent cx="2738438" cy="1280098"/>
             <wp:effectExtent b="0" l="0" r="0" t="0"/>
-            <wp:docPr id="37" name="image33.png"/>
+            <wp:docPr id="36" name="image30.png"/>
             <a:graphic>
               <a:graphicData uri="http://schemas.openxmlformats.org/drawingml/2006/picture">
                 <pic:pic>
                   <pic:nvPicPr>
-                    <pic:cNvPr id="0" name="image33.png"/>
+                    <pic:cNvPr id="0" name="image30.png"/>
                     <pic:cNvPicPr preferRelativeResize="0"/>
                   </pic:nvPicPr>
                   <pic:blipFill>
@@ -3290,12 +4053,12 @@
           <wp:inline distB="114300" distT="114300" distL="114300" distR="114300">
             <wp:extent cx="5148263" cy="1160541"/>
             <wp:effectExtent b="0" l="0" r="0" t="0"/>
-            <wp:docPr id="15" name="image6.png"/>
+            <wp:docPr id="15" name="image23.png"/>
             <a:graphic>
               <a:graphicData uri="http://schemas.openxmlformats.org/drawingml/2006/picture">
                 <pic:pic>
                   <pic:nvPicPr>
-                    <pic:cNvPr id="0" name="image6.png"/>
+                    <pic:cNvPr id="0" name="image23.png"/>
                     <pic:cNvPicPr preferRelativeResize="0"/>
                   </pic:nvPicPr>
                   <pic:blipFill>
@@ -3524,12 +4287,12 @@
           <wp:inline distB="114300" distT="114300" distL="114300" distR="114300">
             <wp:extent cx="1285875" cy="704850"/>
             <wp:effectExtent b="0" l="0" r="0" t="0"/>
-            <wp:docPr id="11" name="image21.png"/>
+            <wp:docPr id="11" name="image8.png"/>
             <a:graphic>
               <a:graphicData uri="http://schemas.openxmlformats.org/drawingml/2006/picture">
                 <pic:pic>
                   <pic:nvPicPr>
-                    <pic:cNvPr id="0" name="image21.png"/>
+                    <pic:cNvPr id="0" name="image8.png"/>
                     <pic:cNvPicPr preferRelativeResize="0"/>
                   </pic:nvPicPr>
                   <pic:blipFill>
@@ -3630,12 +4393,12 @@
           <wp:inline distB="114300" distT="114300" distL="114300" distR="114300">
             <wp:extent cx="1428750" cy="609600"/>
             <wp:effectExtent b="0" l="0" r="0" t="0"/>
-            <wp:docPr id="1" name="image18.png"/>
+            <wp:docPr id="1" name="image16.png"/>
             <a:graphic>
               <a:graphicData uri="http://schemas.openxmlformats.org/drawingml/2006/picture">
                 <pic:pic>
                   <pic:nvPicPr>
-                    <pic:cNvPr id="0" name="image18.png"/>
+                    <pic:cNvPr id="0" name="image16.png"/>
                     <pic:cNvPicPr preferRelativeResize="0"/>
                   </pic:nvPicPr>
                   <pic:blipFill>
@@ -3722,12 +4485,12 @@
           <wp:inline distB="114300" distT="114300" distL="114300" distR="114300">
             <wp:extent cx="1485900" cy="381000"/>
             <wp:effectExtent b="0" l="0" r="0" t="0"/>
-            <wp:docPr id="7" name="image16.png"/>
+            <wp:docPr id="7" name="image13.png"/>
             <a:graphic>
               <a:graphicData uri="http://schemas.openxmlformats.org/drawingml/2006/picture">
                 <pic:pic>
                   <pic:nvPicPr>
-                    <pic:cNvPr id="0" name="image16.png"/>
+                    <pic:cNvPr id="0" name="image13.png"/>
                     <pic:cNvPicPr preferRelativeResize="0"/>
                   </pic:nvPicPr>
                   <pic:blipFill>
@@ -3857,12 +4620,12 @@
           <wp:inline distB="114300" distT="114300" distL="114300" distR="114300">
             <wp:extent cx="5943600" cy="1689100"/>
             <wp:effectExtent b="0" l="0" r="0" t="0"/>
-            <wp:docPr id="52" name="image47.png"/>
+            <wp:docPr id="51" name="image52.png"/>
             <a:graphic>
               <a:graphicData uri="http://schemas.openxmlformats.org/drawingml/2006/picture">
                 <pic:pic>
                   <pic:nvPicPr>
-                    <pic:cNvPr id="0" name="image47.png"/>
+                    <pic:cNvPr id="0" name="image52.png"/>
                     <pic:cNvPicPr preferRelativeResize="0"/>
                   </pic:nvPicPr>
                   <pic:blipFill>
@@ -3991,12 +4754,12 @@
           <wp:inline distB="114300" distT="114300" distL="114300" distR="114300">
             <wp:extent cx="5943600" cy="1841500"/>
             <wp:effectExtent b="0" l="0" r="0" t="0"/>
-            <wp:docPr id="8" name="image14.png"/>
+            <wp:docPr id="8" name="image9.png"/>
             <a:graphic>
               <a:graphicData uri="http://schemas.openxmlformats.org/drawingml/2006/picture">
                 <pic:pic>
                   <pic:nvPicPr>
-                    <pic:cNvPr id="0" name="image14.png"/>
+                    <pic:cNvPr id="0" name="image9.png"/>
                     <pic:cNvPicPr preferRelativeResize="0"/>
                   </pic:nvPicPr>
                   <pic:blipFill>
@@ -4385,12 +5148,12 @@
           <wp:inline distB="114300" distT="114300" distL="114300" distR="114300">
             <wp:extent cx="5943600" cy="5638800"/>
             <wp:effectExtent b="0" l="0" r="0" t="0"/>
-            <wp:docPr id="12" name="image9.png"/>
+            <wp:docPr id="12" name="image7.png"/>
             <a:graphic>
               <a:graphicData uri="http://schemas.openxmlformats.org/drawingml/2006/picture">
                 <pic:pic>
                   <pic:nvPicPr>
-                    <pic:cNvPr id="0" name="image9.png"/>
+                    <pic:cNvPr id="0" name="image7.png"/>
                     <pic:cNvPicPr preferRelativeResize="0"/>
                   </pic:nvPicPr>
                   <pic:blipFill>
@@ -4440,12 +5203,12 @@
           <wp:inline distB="114300" distT="114300" distL="114300" distR="114300">
             <wp:extent cx="4857750" cy="5810250"/>
             <wp:effectExtent b="0" l="0" r="0" t="0"/>
-            <wp:docPr id="49" name="image48.png"/>
+            <wp:docPr id="48" name="image54.png"/>
             <a:graphic>
               <a:graphicData uri="http://schemas.openxmlformats.org/drawingml/2006/picture">
                 <pic:pic>
                   <pic:nvPicPr>
-                    <pic:cNvPr id="0" name="image48.png"/>
+                    <pic:cNvPr id="0" name="image54.png"/>
                     <pic:cNvPicPr preferRelativeResize="0"/>
                   </pic:nvPicPr>
                   <pic:blipFill>
@@ -4580,12 +5343,12 @@
           <wp:inline distB="114300" distT="114300" distL="114300" distR="114300">
             <wp:extent cx="5943600" cy="1117600"/>
             <wp:effectExtent b="0" l="0" r="0" t="0"/>
-            <wp:docPr id="24" name="image24.png"/>
+            <wp:docPr id="23" name="image31.png"/>
             <a:graphic>
               <a:graphicData uri="http://schemas.openxmlformats.org/drawingml/2006/picture">
                 <pic:pic>
                   <pic:nvPicPr>
-                    <pic:cNvPr id="0" name="image24.png"/>
+                    <pic:cNvPr id="0" name="image31.png"/>
                     <pic:cNvPicPr preferRelativeResize="0"/>
                   </pic:nvPicPr>
                   <pic:blipFill>
@@ -4644,12 +5407,12 @@
           <wp:inline distB="114300" distT="114300" distL="114300" distR="114300">
             <wp:extent cx="5943600" cy="2374900"/>
             <wp:effectExtent b="0" l="0" r="0" t="0"/>
-            <wp:docPr id="6" name="image8.png"/>
+            <wp:docPr id="6" name="image3.png"/>
             <a:graphic>
               <a:graphicData uri="http://schemas.openxmlformats.org/drawingml/2006/picture">
                 <pic:pic>
                   <pic:nvPicPr>
-                    <pic:cNvPr id="0" name="image8.png"/>
+                    <pic:cNvPr id="0" name="image3.png"/>
                     <pic:cNvPicPr preferRelativeResize="0"/>
                   </pic:nvPicPr>
                   <pic:blipFill>
@@ -4707,12 +5470,12 @@
           <wp:inline distB="114300" distT="114300" distL="114300" distR="114300">
             <wp:extent cx="5943600" cy="914400"/>
             <wp:effectExtent b="0" l="0" r="0" t="0"/>
-            <wp:docPr id="28" name="image32.png"/>
+            <wp:docPr id="27" name="image21.png"/>
             <a:graphic>
               <a:graphicData uri="http://schemas.openxmlformats.org/drawingml/2006/picture">
                 <pic:pic>
                   <pic:nvPicPr>
-                    <pic:cNvPr id="0" name="image32.png"/>
+                    <pic:cNvPr id="0" name="image21.png"/>
                     <pic:cNvPicPr preferRelativeResize="0"/>
                   </pic:nvPicPr>
                   <pic:blipFill>
@@ -4772,12 +5535,12 @@
           <wp:inline distB="114300" distT="114300" distL="114300" distR="114300">
             <wp:extent cx="5943600" cy="901700"/>
             <wp:effectExtent b="0" l="0" r="0" t="0"/>
-            <wp:docPr id="41" name="image40.png"/>
+            <wp:docPr id="40" name="image38.png"/>
             <a:graphic>
               <a:graphicData uri="http://schemas.openxmlformats.org/drawingml/2006/picture">
                 <pic:pic>
                   <pic:nvPicPr>
-                    <pic:cNvPr id="0" name="image40.png"/>
+                    <pic:cNvPr id="0" name="image38.png"/>
                     <pic:cNvPicPr preferRelativeResize="0"/>
                   </pic:nvPicPr>
                   <pic:blipFill>
@@ -4837,12 +5600,12 @@
           <wp:inline distB="114300" distT="114300" distL="114300" distR="114300">
             <wp:extent cx="5943600" cy="533400"/>
             <wp:effectExtent b="0" l="0" r="0" t="0"/>
-            <wp:docPr id="56" name="image57.png"/>
+            <wp:docPr id="56" name="image53.png"/>
             <a:graphic>
               <a:graphicData uri="http://schemas.openxmlformats.org/drawingml/2006/picture">
                 <pic:pic>
                   <pic:nvPicPr>
-                    <pic:cNvPr id="0" name="image57.png"/>
+                    <pic:cNvPr id="0" name="image53.png"/>
                     <pic:cNvPicPr preferRelativeResize="0"/>
                   </pic:nvPicPr>
                   <pic:blipFill>
@@ -5154,12 +5917,12 @@
           <wp:inline distB="114300" distT="114300" distL="114300" distR="114300">
             <wp:extent cx="5943600" cy="2387600"/>
             <wp:effectExtent b="0" l="0" r="0" t="0"/>
-            <wp:docPr id="30" name="image42.png"/>
+            <wp:docPr id="29" name="image20.png"/>
             <a:graphic>
               <a:graphicData uri="http://schemas.openxmlformats.org/drawingml/2006/picture">
                 <pic:pic>
                   <pic:nvPicPr>
-                    <pic:cNvPr id="0" name="image42.png"/>
+                    <pic:cNvPr id="0" name="image20.png"/>
                     <pic:cNvPicPr preferRelativeResize="0"/>
                   </pic:nvPicPr>
                   <pic:blipFill>
@@ -5295,12 +6058,12 @@
           <wp:inline distB="114300" distT="114300" distL="114300" distR="114300">
             <wp:extent cx="5943600" cy="1231900"/>
             <wp:effectExtent b="0" l="0" r="0" t="0"/>
-            <wp:docPr id="22" name="image22.png"/>
+            <wp:docPr id="21" name="image34.png"/>
             <a:graphic>
               <a:graphicData uri="http://schemas.openxmlformats.org/drawingml/2006/picture">
                 <pic:pic>
                   <pic:nvPicPr>
-                    <pic:cNvPr id="0" name="image22.png"/>
+                    <pic:cNvPr id="0" name="image34.png"/>
                     <pic:cNvPicPr preferRelativeResize="0"/>
                   </pic:nvPicPr>
                   <pic:blipFill>
@@ -5486,12 +6249,12 @@
           <wp:inline distB="114300" distT="114300" distL="114300" distR="114300">
             <wp:extent cx="5943600" cy="2184400"/>
             <wp:effectExtent b="0" l="0" r="0" t="0"/>
-            <wp:docPr id="21" name="image26.png"/>
+            <wp:docPr id="20" name="image14.png"/>
             <a:graphic>
               <a:graphicData uri="http://schemas.openxmlformats.org/drawingml/2006/picture">
                 <pic:pic>
                   <pic:nvPicPr>
-                    <pic:cNvPr id="0" name="image26.png"/>
+                    <pic:cNvPr id="0" name="image14.png"/>
                     <pic:cNvPicPr preferRelativeResize="0"/>
                   </pic:nvPicPr>
                   <pic:blipFill>
@@ -5551,12 +6314,12 @@
           <wp:inline distB="114300" distT="114300" distL="114300" distR="114300">
             <wp:extent cx="4419600" cy="981075"/>
             <wp:effectExtent b="0" l="0" r="0" t="0"/>
-            <wp:docPr id="31" name="image39.png"/>
+            <wp:docPr id="30" name="image32.png"/>
             <a:graphic>
               <a:graphicData uri="http://schemas.openxmlformats.org/drawingml/2006/picture">
                 <pic:pic>
                   <pic:nvPicPr>
-                    <pic:cNvPr id="0" name="image39.png"/>
+                    <pic:cNvPr id="0" name="image32.png"/>
                     <pic:cNvPicPr preferRelativeResize="0"/>
                   </pic:nvPicPr>
                   <pic:blipFill>
@@ -5998,12 +6761,12 @@
           <wp:inline distB="114300" distT="114300" distL="114300" distR="114300">
             <wp:extent cx="5943600" cy="1028700"/>
             <wp:effectExtent b="0" l="0" r="0" t="0"/>
-            <wp:docPr id="14" name="image28.png"/>
+            <wp:docPr id="14" name="image19.png"/>
             <a:graphic>
               <a:graphicData uri="http://schemas.openxmlformats.org/drawingml/2006/picture">
                 <pic:pic>
                   <pic:nvPicPr>
-                    <pic:cNvPr id="0" name="image28.png"/>
+                    <pic:cNvPr id="0" name="image19.png"/>
                     <pic:cNvPicPr preferRelativeResize="0"/>
                   </pic:nvPicPr>
                   <pic:blipFill>
@@ -6043,12 +6806,12 @@
           <wp:inline distB="114300" distT="114300" distL="114300" distR="114300">
             <wp:extent cx="5943600" cy="762000"/>
             <wp:effectExtent b="0" l="0" r="0" t="0"/>
-            <wp:docPr id="53" name="image52.png"/>
+            <wp:docPr id="52" name="image44.png"/>
             <a:graphic>
               <a:graphicData uri="http://schemas.openxmlformats.org/drawingml/2006/picture">
                 <pic:pic>
                   <pic:nvPicPr>
-                    <pic:cNvPr id="0" name="image52.png"/>
+                    <pic:cNvPr id="0" name="image44.png"/>
                     <pic:cNvPicPr preferRelativeResize="0"/>
                   </pic:nvPicPr>
                   <pic:blipFill>
@@ -6306,12 +7069,12 @@
           <wp:inline distB="114300" distT="114300" distL="114300" distR="114300">
             <wp:extent cx="5467350" cy="1181100"/>
             <wp:effectExtent b="0" l="0" r="0" t="0"/>
-            <wp:docPr id="50" name="image49.png"/>
+            <wp:docPr id="49" name="image51.png"/>
             <a:graphic>
               <a:graphicData uri="http://schemas.openxmlformats.org/drawingml/2006/picture">
                 <pic:pic>
                   <pic:nvPicPr>
-                    <pic:cNvPr id="0" name="image49.png"/>
+                    <pic:cNvPr id="0" name="image51.png"/>
                     <pic:cNvPicPr preferRelativeResize="0"/>
                   </pic:nvPicPr>
                   <pic:blipFill>
@@ -6380,12 +7143,12 @@
           <wp:inline distB="114300" distT="114300" distL="114300" distR="114300">
             <wp:extent cx="5943600" cy="3454400"/>
             <wp:effectExtent b="0" l="0" r="0" t="0"/>
-            <wp:docPr id="48" name="image43.png"/>
+            <wp:docPr id="47" name="image47.png"/>
             <a:graphic>
               <a:graphicData uri="http://schemas.openxmlformats.org/drawingml/2006/picture">
                 <pic:pic>
                   <pic:nvPicPr>
-                    <pic:cNvPr id="0" name="image43.png"/>
+                    <pic:cNvPr id="0" name="image47.png"/>
                     <pic:cNvPicPr preferRelativeResize="0"/>
                   </pic:nvPicPr>
                   <pic:blipFill>
@@ -6415,12 +7178,12 @@
           <wp:inline distB="114300" distT="114300" distL="114300" distR="114300">
             <wp:extent cx="5943600" cy="5334000"/>
             <wp:effectExtent b="0" l="0" r="0" t="0"/>
-            <wp:docPr id="19" name="image19.png"/>
+            <wp:docPr id="18" name="image6.png"/>
             <a:graphic>
               <a:graphicData uri="http://schemas.openxmlformats.org/drawingml/2006/picture">
                 <pic:pic>
                   <pic:nvPicPr>
-                    <pic:cNvPr id="0" name="image19.png"/>
+                    <pic:cNvPr id="0" name="image6.png"/>
                     <pic:cNvPicPr preferRelativeResize="0"/>
                   </pic:nvPicPr>
                   <pic:blipFill>
@@ -6909,12 +7672,12 @@
           <wp:inline distB="114300" distT="114300" distL="114300" distR="114300">
             <wp:extent cx="5943600" cy="1295400"/>
             <wp:effectExtent b="0" l="0" r="0" t="0"/>
-            <wp:docPr id="27" name="image25.png"/>
+            <wp:docPr id="26" name="image22.png"/>
             <a:graphic>
               <a:graphicData uri="http://schemas.openxmlformats.org/drawingml/2006/picture">
                 <pic:pic>
                   <pic:nvPicPr>
-                    <pic:cNvPr id="0" name="image25.png"/>
+                    <pic:cNvPr id="0" name="image22.png"/>
                     <pic:cNvPicPr preferRelativeResize="0"/>
                   </pic:nvPicPr>
                   <pic:blipFill>
@@ -7103,12 +7866,12 @@
           <wp:inline distB="114300" distT="114300" distL="114300" distR="114300">
             <wp:extent cx="5943600" cy="2425700"/>
             <wp:effectExtent b="0" l="0" r="0" t="0"/>
-            <wp:docPr id="39" name="image27.png"/>
+            <wp:docPr id="38" name="image37.png"/>
             <a:graphic>
               <a:graphicData uri="http://schemas.openxmlformats.org/drawingml/2006/picture">
                 <pic:pic>
                   <pic:nvPicPr>
-                    <pic:cNvPr id="0" name="image27.png"/>
+                    <pic:cNvPr id="0" name="image37.png"/>
                     <pic:cNvPicPr preferRelativeResize="0"/>
                   </pic:nvPicPr>
                   <pic:blipFill>
@@ -7167,12 +7930,12 @@
           <wp:inline distB="114300" distT="114300" distL="114300" distR="114300">
             <wp:extent cx="5943600" cy="812800"/>
             <wp:effectExtent b="0" l="0" r="0" t="0"/>
-            <wp:docPr id="44" name="image44.png"/>
+            <wp:docPr id="43" name="image49.png"/>
             <a:graphic>
               <a:graphicData uri="http://schemas.openxmlformats.org/drawingml/2006/picture">
                 <pic:pic>
                   <pic:nvPicPr>
-                    <pic:cNvPr id="0" name="image44.png"/>
+                    <pic:cNvPr id="0" name="image49.png"/>
                     <pic:cNvPicPr preferRelativeResize="0"/>
                   </pic:nvPicPr>
                   <pic:blipFill>
@@ -7242,12 +8005,12 @@
           <wp:inline distB="114300" distT="114300" distL="114300" distR="114300">
             <wp:extent cx="5943600" cy="927100"/>
             <wp:effectExtent b="0" l="0" r="0" t="0"/>
-            <wp:docPr id="54" name="image53.png"/>
+            <wp:docPr id="54" name="image56.png"/>
             <a:graphic>
               <a:graphicData uri="http://schemas.openxmlformats.org/drawingml/2006/picture">
                 <pic:pic>
                   <pic:nvPicPr>
-                    <pic:cNvPr id="0" name="image53.png"/>
+                    <pic:cNvPr id="0" name="image56.png"/>
                     <pic:cNvPicPr preferRelativeResize="0"/>
                   </pic:nvPicPr>
                   <pic:blipFill>
@@ -7399,12 +8162,12 @@
           <wp:inline distB="114300" distT="114300" distL="114300" distR="114300">
             <wp:extent cx="4443413" cy="1740337"/>
             <wp:effectExtent b="0" l="0" r="0" t="0"/>
-            <wp:docPr id="3" name="image2.png"/>
+            <wp:docPr id="3" name="image4.png"/>
             <a:graphic>
               <a:graphicData uri="http://schemas.openxmlformats.org/drawingml/2006/picture">
                 <pic:pic>
                   <pic:nvPicPr>
-                    <pic:cNvPr id="0" name="image2.png"/>
+                    <pic:cNvPr id="0" name="image4.png"/>
                     <pic:cNvPicPr preferRelativeResize="0"/>
                   </pic:nvPicPr>
                   <pic:blipFill>
@@ -7486,12 +8249,12 @@
           <wp:inline distB="114300" distT="114300" distL="114300" distR="114300">
             <wp:extent cx="3986213" cy="1198806"/>
             <wp:effectExtent b="0" l="0" r="0" t="0"/>
-            <wp:docPr id="47" name="image37.png"/>
+            <wp:docPr id="46" name="image42.png"/>
             <a:graphic>
               <a:graphicData uri="http://schemas.openxmlformats.org/drawingml/2006/picture">
                 <pic:pic>
                   <pic:nvPicPr>
-                    <pic:cNvPr id="0" name="image37.png"/>
+                    <pic:cNvPr id="0" name="image42.png"/>
                     <pic:cNvPicPr preferRelativeResize="0"/>
                   </pic:nvPicPr>
                   <pic:blipFill>
@@ -7579,12 +8342,12 @@
           <wp:inline distB="114300" distT="114300" distL="114300" distR="114300">
             <wp:extent cx="3466405" cy="1563687"/>
             <wp:effectExtent b="0" l="0" r="0" t="0"/>
-            <wp:docPr id="33" name="image17.png"/>
+            <wp:docPr id="32" name="image35.png"/>
             <a:graphic>
               <a:graphicData uri="http://schemas.openxmlformats.org/drawingml/2006/picture">
                 <pic:pic>
                   <pic:nvPicPr>
-                    <pic:cNvPr id="0" name="image17.png"/>
+                    <pic:cNvPr id="0" name="image35.png"/>
                     <pic:cNvPicPr preferRelativeResize="0"/>
                   </pic:nvPicPr>
                   <pic:blipFill>
@@ -7670,12 +8433,12 @@
           <wp:inline distB="114300" distT="114300" distL="114300" distR="114300">
             <wp:extent cx="5943600" cy="1473200"/>
             <wp:effectExtent b="0" l="0" r="0" t="0"/>
-            <wp:docPr id="23" name="image12.png"/>
+            <wp:docPr id="22" name="image18.png"/>
             <a:graphic>
               <a:graphicData uri="http://schemas.openxmlformats.org/drawingml/2006/picture">
                 <pic:pic>
                   <pic:nvPicPr>
-                    <pic:cNvPr id="0" name="image12.png"/>
+                    <pic:cNvPr id="0" name="image18.png"/>
                     <pic:cNvPicPr preferRelativeResize="0"/>
                   </pic:nvPicPr>
                   <pic:blipFill>
@@ -7734,12 +8497,12 @@
           <wp:inline distB="114300" distT="114300" distL="114300" distR="114300">
             <wp:extent cx="5943600" cy="1955800"/>
             <wp:effectExtent b="0" l="0" r="0" t="0"/>
-            <wp:docPr id="32" name="image50.png"/>
+            <wp:docPr id="31" name="image24.png"/>
             <a:graphic>
               <a:graphicData uri="http://schemas.openxmlformats.org/drawingml/2006/picture">
                 <pic:pic>
                   <pic:nvPicPr>
-                    <pic:cNvPr id="0" name="image50.png"/>
+                    <pic:cNvPr id="0" name="image24.png"/>
                     <pic:cNvPicPr preferRelativeResize="0"/>
                   </pic:nvPicPr>
                   <pic:blipFill>
@@ -7817,12 +8580,12 @@
           <wp:inline distB="114300" distT="114300" distL="114300" distR="114300">
             <wp:extent cx="5943600" cy="584200"/>
             <wp:effectExtent b="0" l="0" r="0" t="0"/>
-            <wp:docPr id="16" name="image7.png"/>
+            <wp:docPr id="16" name="image10.png"/>
             <a:graphic>
               <a:graphicData uri="http://schemas.openxmlformats.org/drawingml/2006/picture">
                 <pic:pic>
                   <pic:nvPicPr>
-                    <pic:cNvPr id="0" name="image7.png"/>
+                    <pic:cNvPr id="0" name="image10.png"/>
                     <pic:cNvPicPr preferRelativeResize="0"/>
                   </pic:nvPicPr>
                   <pic:blipFill>
@@ -8009,12 +8772,12 @@
           <wp:inline distB="114300" distT="114300" distL="114300" distR="114300">
             <wp:extent cx="5943600" cy="1092200"/>
             <wp:effectExtent b="0" l="0" r="0" t="0"/>
-            <wp:docPr id="34" name="image20.png"/>
+            <wp:docPr id="33" name="image25.png"/>
             <a:graphic>
               <a:graphicData uri="http://schemas.openxmlformats.org/drawingml/2006/picture">
                 <pic:pic>
                   <pic:nvPicPr>
-                    <pic:cNvPr id="0" name="image20.png"/>
+                    <pic:cNvPr id="0" name="image25.png"/>
                     <pic:cNvPicPr preferRelativeResize="0"/>
                   </pic:nvPicPr>
                   <pic:blipFill>
@@ -8073,12 +8836,12 @@
           <wp:inline distB="114300" distT="114300" distL="114300" distR="114300">
             <wp:extent cx="2333625" cy="609600"/>
             <wp:effectExtent b="0" l="0" r="0" t="0"/>
-            <wp:docPr id="10" name="image29.png"/>
+            <wp:docPr id="10" name="image12.png"/>
             <a:graphic>
               <a:graphicData uri="http://schemas.openxmlformats.org/drawingml/2006/picture">
                 <pic:pic>
                   <pic:nvPicPr>
-                    <pic:cNvPr id="0" name="image29.png"/>
+                    <pic:cNvPr id="0" name="image12.png"/>
                     <pic:cNvPicPr preferRelativeResize="0"/>
                   </pic:nvPicPr>
                   <pic:blipFill>
@@ -8137,12 +8900,12 @@
           <wp:inline distB="114300" distT="114300" distL="114300" distR="114300">
             <wp:extent cx="4800600" cy="1009650"/>
             <wp:effectExtent b="0" l="0" r="0" t="0"/>
-            <wp:docPr id="40" name="image41.png"/>
+            <wp:docPr id="39" name="image28.png"/>
             <a:graphic>
               <a:graphicData uri="http://schemas.openxmlformats.org/drawingml/2006/picture">
                 <pic:pic>
                   <pic:nvPicPr>
-                    <pic:cNvPr id="0" name="image41.png"/>
+                    <pic:cNvPr id="0" name="image28.png"/>
                     <pic:cNvPicPr preferRelativeResize="0"/>
                   </pic:nvPicPr>
                   <pic:blipFill>
@@ -8193,12 +8956,12 @@
           <wp:inline distB="114300" distT="114300" distL="114300" distR="114300">
             <wp:extent cx="5943600" cy="1104900"/>
             <wp:effectExtent b="0" l="0" r="0" t="0"/>
-            <wp:docPr id="29" name="image30.png"/>
+            <wp:docPr id="28" name="image27.png"/>
             <a:graphic>
               <a:graphicData uri="http://schemas.openxmlformats.org/drawingml/2006/picture">
                 <pic:pic>
                   <pic:nvPicPr>
-                    <pic:cNvPr id="0" name="image30.png"/>
+                    <pic:cNvPr id="0" name="image27.png"/>
                     <pic:cNvPicPr preferRelativeResize="0"/>
                   </pic:nvPicPr>
                   <pic:blipFill>
@@ -8366,12 +9129,12 @@
           <wp:inline distB="114300" distT="114300" distL="114300" distR="114300">
             <wp:extent cx="5248275" cy="1562100"/>
             <wp:effectExtent b="0" l="0" r="0" t="0"/>
-            <wp:docPr id="38" name="image23.png"/>
+            <wp:docPr id="37" name="image36.png"/>
             <a:graphic>
               <a:graphicData uri="http://schemas.openxmlformats.org/drawingml/2006/picture">
                 <pic:pic>
                   <pic:nvPicPr>
-                    <pic:cNvPr id="0" name="image23.png"/>
+                    <pic:cNvPr id="0" name="image36.png"/>
                     <pic:cNvPicPr preferRelativeResize="0"/>
                   </pic:nvPicPr>
                   <pic:blipFill>
@@ -8430,12 +9193,12 @@
           <wp:inline distB="114300" distT="114300" distL="114300" distR="114300">
             <wp:extent cx="5467350" cy="1466850"/>
             <wp:effectExtent b="0" l="0" r="0" t="0"/>
-            <wp:docPr id="17" name="image3.png"/>
+            <wp:docPr id="17" name="image11.png"/>
             <a:graphic>
               <a:graphicData uri="http://schemas.openxmlformats.org/drawingml/2006/picture">
                 <pic:pic>
                   <pic:nvPicPr>
-                    <pic:cNvPr id="0" name="image3.png"/>
+                    <pic:cNvPr id="0" name="image11.png"/>
                     <pic:cNvPicPr preferRelativeResize="0"/>
                   </pic:nvPicPr>
                   <pic:blipFill>
@@ -8494,12 +9257,12 @@
           <wp:inline distB="114300" distT="114300" distL="114300" distR="114300">
             <wp:extent cx="5895975" cy="1733550"/>
             <wp:effectExtent b="0" l="0" r="0" t="0"/>
-            <wp:docPr id="13" name="image13.png"/>
+            <wp:docPr id="13" name="image5.png"/>
             <a:graphic>
               <a:graphicData uri="http://schemas.openxmlformats.org/drawingml/2006/picture">
                 <pic:pic>
                   <pic:nvPicPr>
-                    <pic:cNvPr id="0" name="image13.png"/>
+                    <pic:cNvPr id="0" name="image5.png"/>
                     <pic:cNvPicPr preferRelativeResize="0"/>
                   </pic:nvPicPr>
                   <pic:blipFill>
@@ -8558,12 +9321,12 @@
           <wp:inline distB="114300" distT="114300" distL="114300" distR="114300">
             <wp:extent cx="5734050" cy="1162050"/>
             <wp:effectExtent b="0" l="0" r="0" t="0"/>
-            <wp:docPr id="5" name="image5.png"/>
+            <wp:docPr id="5" name="image17.png"/>
             <a:graphic>
               <a:graphicData uri="http://schemas.openxmlformats.org/drawingml/2006/picture">
                 <pic:pic>
                   <pic:nvPicPr>
-                    <pic:cNvPr id="0" name="image5.png"/>
+                    <pic:cNvPr id="0" name="image17.png"/>
                     <pic:cNvPicPr preferRelativeResize="0"/>
                   </pic:nvPicPr>
                   <pic:blipFill>
@@ -8832,12 +9595,12 @@
           <wp:inline distB="114300" distT="114300" distL="114300" distR="114300">
             <wp:extent cx="5943600" cy="787400"/>
             <wp:effectExtent b="0" l="0" r="0" t="0"/>
-            <wp:docPr id="20" name="image4.png"/>
+            <wp:docPr id="19" name="image26.png"/>
             <a:graphic>
               <a:graphicData uri="http://schemas.openxmlformats.org/drawingml/2006/picture">
                 <pic:pic>
                   <pic:nvPicPr>
-                    <pic:cNvPr id="0" name="image4.png"/>
+                    <pic:cNvPr id="0" name="image26.png"/>
                     <pic:cNvPicPr preferRelativeResize="0"/>
                   </pic:nvPicPr>
                   <pic:blipFill>
@@ -9054,12 +9817,12 @@
           <wp:inline distB="114300" distT="114300" distL="114300" distR="114300">
             <wp:extent cx="5943600" cy="825500"/>
             <wp:effectExtent b="0" l="0" r="0" t="0"/>
-            <wp:docPr id="42" name="image31.png"/>
+            <wp:docPr id="41" name="image41.png"/>
             <a:graphic>
               <a:graphicData uri="http://schemas.openxmlformats.org/drawingml/2006/picture">
                 <pic:pic>
                   <pic:nvPicPr>
-                    <pic:cNvPr id="0" name="image31.png"/>
+                    <pic:cNvPr id="0" name="image41.png"/>
                     <pic:cNvPicPr preferRelativeResize="0"/>
                   </pic:nvPicPr>
                   <pic:blipFill>
@@ -9288,12 +10051,12 @@
           <wp:inline distB="114300" distT="114300" distL="114300" distR="114300">
             <wp:extent cx="5724525" cy="2562225"/>
             <wp:effectExtent b="0" l="0" r="0" t="0"/>
-            <wp:docPr id="2" name="image10.png"/>
+            <wp:docPr id="2" name="image1.png"/>
             <a:graphic>
               <a:graphicData uri="http://schemas.openxmlformats.org/drawingml/2006/picture">
                 <pic:pic>
                   <pic:nvPicPr>
-                    <pic:cNvPr id="0" name="image10.png"/>
+                    <pic:cNvPr id="0" name="image1.png"/>
                     <pic:cNvPicPr preferRelativeResize="0"/>
                   </pic:nvPicPr>
                   <pic:blipFill>
@@ -10795,12 +11558,12 @@
         <wp:inline distB="114300" distT="114300" distL="114300" distR="114300">
           <wp:extent cx="934428" cy="467214"/>
           <wp:effectExtent b="0" l="0" r="0" t="0"/>
-          <wp:docPr id="45" name="image45.png"/>
+          <wp:docPr id="44" name="image33.png"/>
           <a:graphic>
             <a:graphicData uri="http://schemas.openxmlformats.org/drawingml/2006/picture">
               <pic:pic>
                 <pic:nvPicPr>
-                  <pic:cNvPr id="0" name="image45.png"/>
+                  <pic:cNvPr id="0" name="image33.png"/>
                   <pic:cNvPicPr preferRelativeResize="0"/>
                 </pic:nvPicPr>
                 <pic:blipFill>

</xml_diff>